<commit_message>
update F2 func add
</commit_message>
<xml_diff>
--- a/report/빅데이터 20기 프로젝트_보고서_template_ejm.docx
+++ b/report/빅데이터 20기 프로젝트_보고서_template_ejm.docx
@@ -65,9 +65,6 @@
     <w:p>
       <w:pPr>
         <w:pStyle w:val="3"/>
-        <w:rPr>
-          <w:rFonts w:hint="eastAsia"/>
-        </w:rPr>
       </w:pPr>
       <w:r>
         <w:rPr>
@@ -595,52 +592,11 @@
       </w:r>
     </w:p>
     <w:p>
-      <w:pPr>
+      <w:r>
         <w:rPr>
           <w:rFonts w:hint="eastAsia"/>
         </w:rPr>
-      </w:pPr>
-      <w:r>
-        <w:rPr>
-          <w:rFonts w:hint="eastAsia"/>
-        </w:rPr>
-        <w:t xml:space="preserve">[그림 </w:t>
-      </w:r>
-      <w:r>
-        <w:rPr>
-          <w:rFonts w:hint="eastAsia"/>
-        </w:rPr>
-        <w:t>2</w:t>
-      </w:r>
-      <w:r>
-        <w:rPr>
-          <w:rFonts w:hint="eastAsia"/>
-        </w:rPr>
-        <w:t>.</w:t>
-      </w:r>
-      <w:r>
-        <w:rPr>
-          <w:rFonts w:hint="eastAsia"/>
-        </w:rPr>
-        <w:t>5</w:t>
-      </w:r>
-      <w:r>
-        <w:rPr>
-          <w:rFonts w:hint="eastAsia"/>
-        </w:rPr>
-        <w:t xml:space="preserve">.1.1 </w:t>
-      </w:r>
-      <w:r>
-        <w:rPr>
-          <w:rFonts w:hint="eastAsia"/>
-        </w:rPr>
-        <w:t>더미분류 정확도</w:t>
-      </w:r>
-      <w:r>
-        <w:rPr>
-          <w:rFonts w:hint="eastAsia"/>
-        </w:rPr>
-        <w:t>]</w:t>
+        <w:t>[그림 2.5.1.1 더미분류 정확도]</w:t>
       </w:r>
     </w:p>
     <w:p>
@@ -1833,11 +1789,6 @@
       </w:r>
     </w:p>
     <w:p>
-      <w:pPr>
-        <w:rPr>
-          <w:rFonts w:hint="eastAsia"/>
-        </w:rPr>
-      </w:pPr>
       <w:r>
         <w:rPr>
           <w:rFonts w:hint="eastAsia"/>
@@ -2194,7 +2145,7 @@
               <w:spacing w:after="0" w:line="240" w:lineRule="auto"/>
               <w:jc w:val="center"/>
               <w:rPr>
-                <w:rFonts w:ascii="맑은 고딕" w:eastAsia="맑은 고딕" w:hAnsi="맑은 고딕" w:cs="굴림" w:hint="eastAsia"/>
+                <w:rFonts w:ascii="맑은 고딕" w:eastAsia="맑은 고딕" w:hAnsi="맑은 고딕" w:cs="굴림"/>
                 <w:sz w:val="22"/>
                 <w:szCs w:val="22"/>
               </w:rPr>
@@ -2889,7 +2840,7 @@
               <w:spacing w:after="0" w:line="240" w:lineRule="auto"/>
               <w:jc w:val="center"/>
               <w:rPr>
-                <w:rFonts w:ascii="맑은 고딕" w:eastAsia="맑은 고딕" w:hAnsi="맑은 고딕" w:cs="굴림" w:hint="eastAsia"/>
+                <w:rFonts w:ascii="맑은 고딕" w:eastAsia="맑은 고딕" w:hAnsi="맑은 고딕" w:cs="굴림"/>
                 <w:sz w:val="22"/>
                 <w:szCs w:val="22"/>
               </w:rPr>
@@ -3156,7 +3107,19 @@
         <w:rPr>
           <w:rFonts w:hint="eastAsia"/>
         </w:rPr>
-        <w:t>추가적인 데이터 전 처리 진행 후 유의미한 성능 향상이 되었다.</w:t>
+        <w:t xml:space="preserve">추가적인 데이터 전 처리 진행 후 </w:t>
+      </w:r>
+      <w:r>
+        <w:rPr>
+          <w:rFonts w:hint="eastAsia"/>
+        </w:rPr>
+        <w:t xml:space="preserve">ROC-AUC는 감소하였으나 F1-Score와 recall 에서는 </w:t>
+      </w:r>
+      <w:r>
+        <w:rPr>
+          <w:rFonts w:hint="eastAsia"/>
+        </w:rPr>
+        <w:t>유의미한 성능 향상이 되었다.</w:t>
       </w:r>
     </w:p>
     <w:p>
@@ -3292,47 +3255,15 @@
     <w:p>
       <w:pPr>
         <w:jc w:val="center"/>
+      </w:pPr>
+      <w:r>
         <w:rPr>
           <w:rFonts w:hint="eastAsia"/>
         </w:rPr>
-      </w:pPr>
-      <w:r>
-        <w:rPr>
-          <w:rFonts w:hint="eastAsia"/>
-        </w:rPr>
-        <w:t>[그림 2.5.1.</w:t>
-      </w:r>
-      <w:r>
-        <w:rPr>
-          <w:rFonts w:hint="eastAsia"/>
-        </w:rPr>
-        <w:t>2</w:t>
-      </w:r>
-      <w:r>
-        <w:rPr>
-          <w:rFonts w:hint="eastAsia"/>
-        </w:rPr>
-        <w:t xml:space="preserve"> </w:t>
-      </w:r>
-      <w:r>
-        <w:rPr>
-          <w:rFonts w:hint="eastAsia"/>
-        </w:rPr>
-        <w:t>threshold별 삭제 컬럼 수</w:t>
-      </w:r>
-      <w:r>
-        <w:rPr>
-          <w:rFonts w:hint="eastAsia"/>
-        </w:rPr>
-        <w:t>]</w:t>
+        <w:t>[그림 2.5.1.2 threshold별 삭제 컬럼 수]</w:t>
       </w:r>
     </w:p>
     <w:p>
-      <w:pPr>
-        <w:rPr>
-          <w:rFonts w:hint="eastAsia"/>
-        </w:rPr>
-      </w:pPr>
       <w:r>
         <w:rPr>
           <w:rFonts w:hint="eastAsia"/>
@@ -3413,11 +3344,6 @@
             <w:vAlign w:val="center"/>
           </w:tcPr>
           <w:p>
-            <w:pPr>
-              <w:rPr>
-                <w:rFonts w:hint="eastAsia"/>
-              </w:rPr>
-            </w:pPr>
             <w:r>
               <w:rPr>
                 <w:b/>
@@ -3433,11 +3359,6 @@
             <w:vAlign w:val="center"/>
           </w:tcPr>
           <w:p>
-            <w:pPr>
-              <w:rPr>
-                <w:rFonts w:hint="eastAsia"/>
-              </w:rPr>
-            </w:pPr>
             <w:r>
               <w:rPr>
                 <w:b/>
@@ -3453,11 +3374,6 @@
             <w:vAlign w:val="center"/>
           </w:tcPr>
           <w:p>
-            <w:pPr>
-              <w:rPr>
-                <w:rFonts w:hint="eastAsia"/>
-              </w:rPr>
-            </w:pPr>
             <w:r>
               <w:rPr>
                 <w:b/>
@@ -3473,11 +3389,6 @@
             <w:vAlign w:val="center"/>
           </w:tcPr>
           <w:p>
-            <w:pPr>
-              <w:rPr>
-                <w:rFonts w:hint="eastAsia"/>
-              </w:rPr>
-            </w:pPr>
             <w:r>
               <w:rPr>
                 <w:b/>
@@ -3495,11 +3406,6 @@
             <w:vAlign w:val="center"/>
           </w:tcPr>
           <w:p>
-            <w:pPr>
-              <w:rPr>
-                <w:rFonts w:hint="eastAsia"/>
-              </w:rPr>
-            </w:pPr>
             <w:proofErr w:type="spellStart"/>
             <w:r>
               <w:rPr>
@@ -3516,11 +3422,6 @@
             <w:vAlign w:val="center"/>
           </w:tcPr>
           <w:p>
-            <w:pPr>
-              <w:rPr>
-                <w:rFonts w:hint="eastAsia"/>
-              </w:rPr>
-            </w:pPr>
             <w:r>
               <w:t>0.8509 → 0.8402 (↓0.0107)</w:t>
             </w:r>
@@ -3532,11 +3433,6 @@
             <w:vAlign w:val="center"/>
           </w:tcPr>
           <w:p>
-            <w:pPr>
-              <w:rPr>
-                <w:rFonts w:hint="eastAsia"/>
-              </w:rPr>
-            </w:pPr>
             <w:r>
               <w:t>0.2974 → 0.535 (↑</w:t>
             </w:r>
@@ -3557,11 +3453,6 @@
             <w:vAlign w:val="center"/>
           </w:tcPr>
           <w:p>
-            <w:pPr>
-              <w:rPr>
-                <w:rFonts w:hint="eastAsia"/>
-              </w:rPr>
-            </w:pPr>
             <w:r>
               <w:t>0.515 → 0.7425 (↑</w:t>
             </w:r>
@@ -3584,11 +3475,6 @@
             <w:vAlign w:val="center"/>
           </w:tcPr>
           <w:p>
-            <w:pPr>
-              <w:rPr>
-                <w:rFonts w:hint="eastAsia"/>
-              </w:rPr>
-            </w:pPr>
             <w:proofErr w:type="spellStart"/>
             <w:r>
               <w:rPr>
@@ -3605,11 +3491,6 @@
             <w:vAlign w:val="center"/>
           </w:tcPr>
           <w:p>
-            <w:pPr>
-              <w:rPr>
-                <w:rFonts w:hint="eastAsia"/>
-              </w:rPr>
-            </w:pPr>
             <w:r>
               <w:t>0.8438 → 0.8452 (↑0.0014)</w:t>
             </w:r>
@@ -3621,11 +3502,6 @@
             <w:vAlign w:val="center"/>
           </w:tcPr>
           <w:p>
-            <w:pPr>
-              <w:rPr>
-                <w:rFonts w:hint="eastAsia"/>
-              </w:rPr>
-            </w:pPr>
             <w:r>
               <w:t>0.0099 → 0.287 (↑</w:t>
             </w:r>
@@ -3646,11 +3522,6 @@
             <w:vAlign w:val="center"/>
           </w:tcPr>
           <w:p>
-            <w:pPr>
-              <w:rPr>
-                <w:rFonts w:hint="eastAsia"/>
-              </w:rPr>
-            </w:pPr>
             <w:r>
               <w:t>0.005 → 0.5598 (↑</w:t>
             </w:r>
@@ -3673,11 +3544,6 @@
             <w:vAlign w:val="center"/>
           </w:tcPr>
           <w:p>
-            <w:pPr>
-              <w:rPr>
-                <w:rFonts w:hint="eastAsia"/>
-              </w:rPr>
-            </w:pPr>
             <w:proofErr w:type="spellStart"/>
             <w:r>
               <w:rPr>
@@ -3694,11 +3560,6 @@
             <w:vAlign w:val="center"/>
           </w:tcPr>
           <w:p>
-            <w:pPr>
-              <w:rPr>
-                <w:rFonts w:hint="eastAsia"/>
-              </w:rPr>
-            </w:pPr>
             <w:r>
               <w:t>0.8051 → 0.8063 (↑0.0012)</w:t>
             </w:r>
@@ -3710,11 +3571,6 @@
             <w:vAlign w:val="center"/>
           </w:tcPr>
           <w:p>
-            <w:pPr>
-              <w:rPr>
-                <w:rFonts w:hint="eastAsia"/>
-              </w:rPr>
-            </w:pPr>
             <w:r>
               <w:t>0.0129 → 0.1617 (↑</w:t>
             </w:r>
@@ -3735,11 +3591,6 @@
             <w:vAlign w:val="center"/>
           </w:tcPr>
           <w:p>
-            <w:pPr>
-              <w:rPr>
-                <w:rFonts w:hint="eastAsia"/>
-              </w:rPr>
-            </w:pPr>
             <w:r>
               <w:t>0.0066 → 0.7724 (↑</w:t>
             </w:r>
@@ -3762,11 +3613,6 @@
             <w:vAlign w:val="center"/>
           </w:tcPr>
           <w:p>
-            <w:pPr>
-              <w:rPr>
-                <w:rFonts w:hint="eastAsia"/>
-              </w:rPr>
-            </w:pPr>
             <w:proofErr w:type="spellStart"/>
             <w:r>
               <w:rPr>
@@ -3784,11 +3630,6 @@
             <w:vAlign w:val="center"/>
           </w:tcPr>
           <w:p>
-            <w:pPr>
-              <w:rPr>
-                <w:rFonts w:hint="eastAsia"/>
-              </w:rPr>
-            </w:pPr>
             <w:r>
               <w:t>0.8422 → 0.8263 (↓0.0159)</w:t>
             </w:r>
@@ -3800,11 +3641,6 @@
             <w:vAlign w:val="center"/>
           </w:tcPr>
           <w:p>
-            <w:pPr>
-              <w:rPr>
-                <w:rFonts w:hint="eastAsia"/>
-              </w:rPr>
-            </w:pPr>
             <w:r>
               <w:t>0.0163 → 0.2653 (↑</w:t>
             </w:r>
@@ -3825,11 +3661,6 @@
             <w:vAlign w:val="center"/>
           </w:tcPr>
           <w:p>
-            <w:pPr>
-              <w:rPr>
-                <w:rFonts w:hint="eastAsia"/>
-              </w:rPr>
-            </w:pPr>
             <w:r>
               <w:t>0.0083 → 0.3953 (↑</w:t>
             </w:r>
@@ -3861,9 +3692,6 @@
     <w:p>
       <w:pPr>
         <w:pStyle w:val="4"/>
-        <w:rPr>
-          <w:rFonts w:hint="eastAsia"/>
-        </w:rPr>
       </w:pPr>
       <w:r>
         <w:rPr>
@@ -3875,16 +3703,13 @@
     <w:p>
       <w:pPr>
         <w:pStyle w:val="4"/>
-        <w:rPr>
-          <w:rFonts w:hint="eastAsia"/>
-        </w:rPr>
       </w:pPr>
       <w:r>
         <w:rPr>
           <w:noProof/>
         </w:rPr>
         <w:drawing>
-          <wp:anchor distT="0" distB="0" distL="114300" distR="114300" simplePos="0" relativeHeight="251658240" behindDoc="1" locked="0" layoutInCell="1" allowOverlap="0" wp14:anchorId="21E265FB" wp14:editId="54962A60">
+          <wp:anchor distT="0" distB="0" distL="114300" distR="114300" simplePos="0" relativeHeight="251658240" behindDoc="1" locked="0" layoutInCell="1" allowOverlap="0" wp14:anchorId="21E265FB" wp14:editId="2ADCD8DD">
             <wp:simplePos x="0" y="0"/>
             <wp:positionH relativeFrom="margin">
               <wp:align>center</wp:align>
@@ -3984,40 +3809,11 @@
     <w:p/>
     <w:p/>
     <w:p>
-      <w:pPr>
+      <w:r>
         <w:rPr>
           <w:rFonts w:hint="eastAsia"/>
         </w:rPr>
-      </w:pPr>
-      <w:r>
-        <w:rPr>
-          <w:rFonts w:hint="eastAsia"/>
-        </w:rPr>
-        <w:t>[그림 2.5.</w:t>
-      </w:r>
-      <w:r>
-        <w:rPr>
-          <w:rFonts w:hint="eastAsia"/>
-        </w:rPr>
-        <w:t>2</w:t>
-      </w:r>
-      <w:r>
-        <w:rPr>
-          <w:rFonts w:hint="eastAsia"/>
-        </w:rPr>
-        <w:t xml:space="preserve">.1 </w:t>
-      </w:r>
-      <w:r>
-        <w:rPr>
-          <w:rFonts w:hint="eastAsia"/>
-        </w:rPr>
-        <w:t>모델 별 피처 중요도 비교</w:t>
-      </w:r>
-      <w:r>
-        <w:rPr>
-          <w:rFonts w:hint="eastAsia"/>
-        </w:rPr>
-        <w:t>]</w:t>
+        <w:t>[그림 2.5.2.1 모델 별 피처 중요도 비교]</w:t>
       </w:r>
     </w:p>
     <w:p>
@@ -4032,11 +3828,6 @@
       </w:r>
     </w:p>
     <w:p>
-      <w:pPr>
-        <w:rPr>
-          <w:rFonts w:hint="eastAsia"/>
-        </w:rPr>
-      </w:pPr>
       <w:r>
         <w:rPr>
           <w:rFonts w:hint="eastAsia"/>
@@ -4051,10 +3842,10 @@
         <w:tblLook w:val="04A0" w:firstRow="1" w:lastRow="0" w:firstColumn="1" w:lastColumn="0" w:noHBand="0" w:noVBand="1"/>
       </w:tblPr>
       <w:tblGrid>
-        <w:gridCol w:w="637"/>
-        <w:gridCol w:w="2375"/>
-        <w:gridCol w:w="2374"/>
-        <w:gridCol w:w="2498"/>
+        <w:gridCol w:w="636"/>
+        <w:gridCol w:w="2372"/>
+        <w:gridCol w:w="2371"/>
+        <w:gridCol w:w="2505"/>
         <w:gridCol w:w="2572"/>
       </w:tblGrid>
       <w:tr>
@@ -4065,9 +3856,6 @@
           <w:p>
             <w:pPr>
               <w:jc w:val="center"/>
-              <w:rPr>
-                <w:rFonts w:hint="eastAsia"/>
-              </w:rPr>
             </w:pPr>
             <w:r>
               <w:rPr>
@@ -4085,13 +3873,16 @@
             <w:pPr>
               <w:jc w:val="center"/>
               <w:rPr>
-                <w:rFonts w:hint="eastAsia"/>
+                <w:b/>
+                <w:bCs/>
               </w:rPr>
             </w:pPr>
             <w:proofErr w:type="spellStart"/>
             <w:r>
               <w:rPr>
                 <w:rFonts w:hint="eastAsia"/>
+                <w:b/>
+                <w:bCs/>
               </w:rPr>
               <w:t>XGBoost</w:t>
             </w:r>
@@ -4106,13 +3897,16 @@
             <w:pPr>
               <w:jc w:val="center"/>
               <w:rPr>
-                <w:rFonts w:hint="eastAsia"/>
+                <w:b/>
+                <w:bCs/>
               </w:rPr>
             </w:pPr>
             <w:proofErr w:type="spellStart"/>
             <w:r>
               <w:rPr>
                 <w:rFonts w:hint="eastAsia"/>
+                <w:b/>
+                <w:bCs/>
               </w:rPr>
               <w:t>LightGBM</w:t>
             </w:r>
@@ -4127,13 +3921,16 @@
             <w:pPr>
               <w:jc w:val="center"/>
               <w:rPr>
-                <w:rFonts w:hint="eastAsia"/>
+                <w:b/>
+                <w:bCs/>
               </w:rPr>
             </w:pPr>
             <w:proofErr w:type="spellStart"/>
             <w:r>
               <w:rPr>
                 <w:rFonts w:hint="eastAsia"/>
+                <w:b/>
+                <w:bCs/>
               </w:rPr>
               <w:t>RandomForest</w:t>
             </w:r>
@@ -4148,13 +3945,16 @@
             <w:pPr>
               <w:jc w:val="center"/>
               <w:rPr>
-                <w:rFonts w:hint="eastAsia"/>
+                <w:b/>
+                <w:bCs/>
               </w:rPr>
             </w:pPr>
             <w:proofErr w:type="spellStart"/>
             <w:r>
               <w:rPr>
                 <w:rFonts w:hint="eastAsia"/>
+                <w:b/>
+                <w:bCs/>
               </w:rPr>
               <w:t>LogisticRegression</w:t>
             </w:r>
@@ -4168,11 +3968,6 @@
             <w:tcW w:w="636" w:type="dxa"/>
           </w:tcPr>
           <w:p>
-            <w:pPr>
-              <w:rPr>
-                <w:rFonts w:hint="eastAsia"/>
-              </w:rPr>
-            </w:pPr>
             <w:r>
               <w:t xml:space="preserve">1위 </w:t>
             </w:r>
@@ -4185,9 +3980,6 @@
           <w:p>
             <w:pPr>
               <w:jc w:val="center"/>
-              <w:rPr>
-                <w:rFonts w:hint="eastAsia"/>
-              </w:rPr>
             </w:pPr>
             <w:r>
               <w:t>saldo_var30</w:t>
@@ -4201,9 +3993,6 @@
           <w:p>
             <w:pPr>
               <w:jc w:val="center"/>
-              <w:rPr>
-                <w:rFonts w:hint="eastAsia"/>
-              </w:rPr>
             </w:pPr>
             <w:r>
               <w:t>var38</w:t>
@@ -4217,9 +4006,6 @@
           <w:p>
             <w:pPr>
               <w:jc w:val="center"/>
-              <w:rPr>
-                <w:rFonts w:hint="eastAsia"/>
-              </w:rPr>
             </w:pPr>
             <w:r>
               <w:t>var15</w:t>
@@ -4233,9 +4019,6 @@
           <w:p>
             <w:pPr>
               <w:jc w:val="center"/>
-              <w:rPr>
-                <w:rFonts w:hint="eastAsia"/>
-              </w:rPr>
             </w:pPr>
             <w:r>
               <w:t>I</w:t>
@@ -4255,11 +4038,6 @@
             <w:tcW w:w="636" w:type="dxa"/>
           </w:tcPr>
           <w:p>
-            <w:pPr>
-              <w:rPr>
-                <w:rFonts w:hint="eastAsia"/>
-              </w:rPr>
-            </w:pPr>
             <w:r>
               <w:t>2위</w:t>
             </w:r>
@@ -4272,9 +4050,6 @@
           <w:p>
             <w:pPr>
               <w:jc w:val="center"/>
-              <w:rPr>
-                <w:rFonts w:hint="eastAsia"/>
-              </w:rPr>
             </w:pPr>
             <w:r>
               <w:t>var15</w:t>
@@ -4288,9 +4063,6 @@
           <w:p>
             <w:pPr>
               <w:jc w:val="center"/>
-              <w:rPr>
-                <w:rFonts w:hint="eastAsia"/>
-              </w:rPr>
             </w:pPr>
             <w:r>
               <w:t>var15</w:t>
@@ -4304,9 +4076,6 @@
           <w:p>
             <w:pPr>
               <w:jc w:val="center"/>
-              <w:rPr>
-                <w:rFonts w:hint="eastAsia"/>
-              </w:rPr>
             </w:pPr>
             <w:r>
               <w:t>saldo_var30</w:t>
@@ -4320,9 +4089,6 @@
           <w:p>
             <w:pPr>
               <w:jc w:val="center"/>
-              <w:rPr>
-                <w:rFonts w:hint="eastAsia"/>
-              </w:rPr>
             </w:pPr>
             <w:r>
               <w:rPr>
@@ -4339,11 +4105,6 @@
             <w:tcW w:w="636" w:type="dxa"/>
           </w:tcPr>
           <w:p>
-            <w:pPr>
-              <w:rPr>
-                <w:rFonts w:hint="eastAsia"/>
-              </w:rPr>
-            </w:pPr>
             <w:r>
               <w:t>3위</w:t>
             </w:r>
@@ -4356,9 +4117,6 @@
           <w:p>
             <w:pPr>
               <w:jc w:val="center"/>
-              <w:rPr>
-                <w:rFonts w:hint="eastAsia"/>
-              </w:rPr>
             </w:pPr>
             <w:r>
               <w:t>ind_var30_</w:t>
@@ -4378,9 +4136,6 @@
           <w:p>
             <w:pPr>
               <w:jc w:val="center"/>
-              <w:rPr>
-                <w:rFonts w:hint="eastAsia"/>
-              </w:rPr>
             </w:pPr>
             <w:r>
               <w:t>saldo_var30</w:t>
@@ -4394,9 +4149,6 @@
           <w:p>
             <w:pPr>
               <w:jc w:val="center"/>
-              <w:rPr>
-                <w:rFonts w:hint="eastAsia"/>
-              </w:rPr>
             </w:pPr>
             <w:r>
               <w:t>var38</w:t>
@@ -4410,9 +4162,6 @@
           <w:p>
             <w:pPr>
               <w:jc w:val="center"/>
-              <w:rPr>
-                <w:rFonts w:hint="eastAsia"/>
-              </w:rPr>
             </w:pPr>
             <w:r>
               <w:t>S</w:t>
@@ -4428,13 +4177,7 @@
       </w:tr>
     </w:tbl>
     <w:p/>
-    <w:p>
-      <w:pPr>
-        <w:rPr>
-          <w:rFonts w:hint="eastAsia"/>
-        </w:rPr>
-      </w:pPr>
-    </w:p>
+    <w:p/>
     <w:p>
       <w:r>
         <w:rPr>
@@ -4787,11 +4530,6 @@
       </w:r>
     </w:p>
     <w:p>
-      <w:pPr>
-        <w:rPr>
-          <w:rFonts w:hint="eastAsia"/>
-        </w:rPr>
-      </w:pPr>
       <w:proofErr w:type="spellStart"/>
       <w:r>
         <w:rPr>
@@ -4965,13 +4703,7 @@
         </w:rPr>
       </w:pPr>
     </w:p>
-    <w:p>
-      <w:pPr>
-        <w:rPr>
-          <w:rFonts w:hint="eastAsia"/>
-        </w:rPr>
-      </w:pPr>
-    </w:p>
+    <w:p/>
     <w:p>
       <w:pPr>
         <w:pStyle w:val="3"/>
@@ -4995,13 +4727,7 @@
         <w:t>2.5.3.1 예측 vs 실제 비교</w:t>
       </w:r>
     </w:p>
-    <w:p>
-      <w:pPr>
-        <w:rPr>
-          <w:rFonts w:hint="eastAsia"/>
-        </w:rPr>
-      </w:pPr>
-    </w:p>
+    <w:p/>
     <w:p>
       <w:pPr>
         <w:pStyle w:val="4"/>
@@ -5027,9 +4753,6 @@
     <w:p>
       <w:pPr>
         <w:pStyle w:val="3"/>
-        <w:rPr>
-          <w:rFonts w:hint="eastAsia"/>
-        </w:rPr>
       </w:pPr>
       <w:r>
         <w:rPr>
@@ -11652,6 +11375,7 @@
   <w:style w:type="character" w:default="1" w:styleId="a0">
     <w:name w:val="Default Paragraph Font"/>
     <w:uiPriority w:val="1"/>
+    <w:semiHidden/>
     <w:unhideWhenUsed/>
   </w:style>
   <w:style w:type="table" w:default="1" w:styleId="a1">

</xml_diff>